<commit_message>
review citation text for checklist docx
</commit_message>
<xml_diff>
--- a/training/research-cycle-handbook/assets/checklists/Plan.Design.Checklist.docx
+++ b/training/research-cycle-handbook/assets/checklists/Plan.Design.Checklist.docx
@@ -44,7 +44,12 @@
           <w:lang w:val="en-US"/>
         </w:rPr>
         <w:sectPr>
-          <w:footerReference w:type="default" r:id="rId7"/>
+          <w:headerReference w:type="even" r:id="rId7"/>
+          <w:headerReference w:type="default" r:id="rId8"/>
+          <w:footerReference w:type="even" r:id="rId9"/>
+          <w:footerReference w:type="default" r:id="rId10"/>
+          <w:headerReference w:type="first" r:id="rId11"/>
+          <w:footerReference w:type="first" r:id="rId12"/>
           <w:pgSz w:w="16838" w:h="11906" w:orient="landscape"/>
           <w:pgMar w:top="1440" w:right="1440" w:bottom="1440" w:left="1440" w:header="720" w:footer="720" w:gutter="0"/>
           <w:cols w:space="720"/>
@@ -180,11 +185,6 @@
           <w:lang w:val="en-US"/>
         </w:rPr>
         <w:tab/>
-      </w:r>
-      <w:r>
-        <w:rPr>
-          <w:lang w:val="en-US"/>
-        </w:rPr>
         <w:t xml:space="preserve"> </w:t>
       </w:r>
       <w:r>
@@ -286,11 +286,6 @@
           <w:lang w:val="en-US"/>
         </w:rPr>
         <w:tab/>
-      </w:r>
-      <w:r>
-        <w:rPr>
-          <w:lang w:val="en-US"/>
-        </w:rPr>
         <w:t xml:space="preserve"> </w:t>
       </w:r>
       <w:r>
@@ -724,6 +719,9 @@
     <w:p>
       <w:pPr>
         <w:ind w:left="270"/>
+        <w:rPr>
+          <w:lang w:val="en-US"/>
+        </w:rPr>
       </w:pPr>
       <w:sdt>
         <w:sdtPr>
@@ -754,9 +752,15 @@
         <w:tab/>
       </w:r>
       <w:r>
+        <w:rPr>
+          <w:lang w:val="en-US"/>
+        </w:rPr>
         <w:t xml:space="preserve"> </w:t>
       </w:r>
       <w:r>
+        <w:rPr>
+          <w:lang w:val="en-US"/>
+        </w:rPr>
         <w:t>Anonymization procedures defined</w:t>
       </w:r>
     </w:p>
@@ -794,11 +798,6 @@
           <w:lang w:val="en-US"/>
         </w:rPr>
         <w:tab/>
-      </w:r>
-      <w:r>
-        <w:rPr>
-          <w:lang w:val="en-US"/>
-        </w:rPr>
         <w:t xml:space="preserve"> </w:t>
       </w:r>
       <w:r>
@@ -857,11 +856,6 @@
           <w:lang w:val="en-US"/>
         </w:rPr>
         <w:tab/>
-      </w:r>
-      <w:r>
-        <w:rPr>
-          <w:lang w:val="en-US"/>
-        </w:rPr>
         <w:t xml:space="preserve"> </w:t>
       </w:r>
       <w:r>
@@ -953,11 +947,6 @@
           <w:lang w:val="en-US"/>
         </w:rPr>
         <w:tab/>
-      </w:r>
-      <w:r>
-        <w:rPr>
-          <w:lang w:val="en-US"/>
-        </w:rPr>
         <w:t xml:space="preserve"> </w:t>
       </w:r>
       <w:r>
@@ -1016,11 +1005,6 @@
           <w:lang w:val="en-US"/>
         </w:rPr>
         <w:tab/>
-      </w:r>
-      <w:r>
-        <w:rPr>
-          <w:lang w:val="en-US"/>
-        </w:rPr>
         <w:t xml:space="preserve"> </w:t>
       </w:r>
       <w:r>
@@ -1064,11 +1048,6 @@
           <w:lang w:val="en-US"/>
         </w:rPr>
         <w:tab/>
-      </w:r>
-      <w:r>
-        <w:rPr>
-          <w:lang w:val="en-US"/>
-        </w:rPr>
         <w:t xml:space="preserve"> </w:t>
       </w:r>
       <w:r>
@@ -1112,11 +1091,6 @@
           <w:lang w:val="en-US"/>
         </w:rPr>
         <w:tab/>
-      </w:r>
-      <w:r>
-        <w:rPr>
-          <w:lang w:val="en-US"/>
-        </w:rPr>
         <w:t xml:space="preserve"> </w:t>
       </w:r>
       <w:r>
@@ -1160,11 +1134,6 @@
           <w:lang w:val="en-US"/>
         </w:rPr>
         <w:tab/>
-      </w:r>
-      <w:r>
-        <w:rPr>
-          <w:lang w:val="en-US"/>
-        </w:rPr>
         <w:t xml:space="preserve"> </w:t>
       </w:r>
       <w:r>
@@ -1215,6 +1184,16 @@
   <w:p>
     <w:pPr>
       <w:pStyle w:val="Footer"/>
+    </w:pPr>
+  </w:p>
+</w:ftr>
+</file>
+
+<file path=word/footer2.xml><?xml version="1.0" encoding="utf-8"?>
+<w:ftr xmlns:wpc="http://schemas.microsoft.com/office/word/2010/wordprocessingCanvas" xmlns:cx="http://schemas.microsoft.com/office/drawing/2014/chartex" xmlns:cx1="http://schemas.microsoft.com/office/drawing/2015/9/8/chartex" xmlns:cx2="http://schemas.microsoft.com/office/drawing/2015/10/21/chartex" xmlns:cx3="http://schemas.microsoft.com/office/drawing/2016/5/9/chartex" xmlns:cx4="http://schemas.microsoft.com/office/drawing/2016/5/10/chartex" xmlns:cx5="http://schemas.microsoft.com/office/drawing/2016/5/11/chartex" xmlns:cx6="http://schemas.microsoft.com/office/drawing/2016/5/12/chartex" xmlns:cx7="http://schemas.microsoft.com/office/drawing/2016/5/13/chartex" xmlns:cx8="http://schemas.microsoft.com/office/drawing/2016/5/14/chartex" xmlns:mc="http://schemas.openxmlformats.org/markup-compatibility/2006" xmlns:aink="http://schemas.microsoft.com/office/drawing/2016/ink" xmlns:am3d="http://schemas.microsoft.com/office/drawing/2017/model3d" xmlns:o="urn:schemas-microsoft-com:office:office" xmlns:oel="http://schemas.microsoft.com/office/2019/extlst" xmlns:r="http://schemas.openxmlformats.org/officeDocument/2006/relationships" xmlns:m="http://schemas.openxmlformats.org/officeDocument/2006/math" xmlns:v="urn:schemas-microsoft-com:vml" xmlns:wp14="http://schemas.microsoft.com/office/word/2010/wordprocessingDrawing" xmlns:wp="http://schemas.openxmlformats.org/drawingml/2006/wordprocessingDrawing" xmlns:w10="urn:schemas-microsoft-com:office:word" xmlns:w="http://schemas.openxmlformats.org/wordprocessingml/2006/main" xmlns:w14="http://schemas.microsoft.com/office/word/2010/wordml" xmlns:w15="http://schemas.microsoft.com/office/word/2012/wordml" xmlns:w16cex="http://schemas.microsoft.com/office/word/2018/wordml/cex" xmlns:w16cid="http://schemas.microsoft.com/office/word/2016/wordml/cid" xmlns:w16="http://schemas.microsoft.com/office/word/2018/wordml" xmlns:w16sdtdh="http://schemas.microsoft.com/office/word/2020/wordml/sdtdatahash" xmlns:w16se="http://schemas.microsoft.com/office/word/2015/wordml/symex" xmlns:wpg="http://schemas.microsoft.com/office/word/2010/wordprocessingGroup" xmlns:wpi="http://schemas.microsoft.com/office/word/2010/wordprocessingInk" xmlns:wne="http://schemas.microsoft.com/office/word/2006/wordml" xmlns:wps="http://schemas.microsoft.com/office/word/2010/wordprocessingShape" mc:Ignorable="w14 w15 w16se w16cid w16 w16cex w16sdtdh wp14">
+  <w:p>
+    <w:pPr>
+      <w:pStyle w:val="Footer"/>
       <w:rPr>
         <w:lang w:val="en-US"/>
       </w:rPr>
@@ -1225,9 +1204,50 @@
         <w:iCs/>
         <w:lang w:val="en-US"/>
       </w:rPr>
-      <w:t xml:space="preserve">Ihle Malika, Gupta Reema, Schönbrodt Felix 2026 Open Research Cycle Handbook, </w:t>
+      <w:t>Ihle Malika, Gupta Reema, Schönbrodt Felix 2026 Open Research Cycle Handbook</w:t>
     </w:r>
-    <w:hyperlink r:id="rId1" w:history="1">
+    <w:r>
+      <w:rPr>
+        <w:i/>
+        <w:iCs/>
+        <w:lang w:val="en-US"/>
+      </w:rPr>
+      <w:t xml:space="preserve"> </w:t>
+    </w:r>
+    <w:r>
+      <w:rPr>
+        <w:i/>
+        <w:iCs/>
+        <w:lang w:val="en-US"/>
+      </w:rPr>
+      <w:t xml:space="preserve">Plan &amp; Design Checklist </w:t>
+    </w:r>
+    <w:r>
+      <w:rPr>
+        <w:i/>
+        <w:iCs/>
+        <w:lang w:val="en-US"/>
+      </w:rPr>
+      <w:t>v 1.0</w:t>
+    </w:r>
+    <w:r>
+      <w:rPr>
+        <w:i/>
+        <w:iCs/>
+        <w:lang w:val="en-US"/>
+      </w:rPr>
+      <w:t xml:space="preserve">, </w:t>
+    </w:r>
+    <w:hyperlink r:id="rId1" w:history="1"/>
+    <w:r>
+      <w:rPr>
+        <w:i/>
+        <w:iCs/>
+        <w:lang w:val="en-US"/>
+      </w:rPr>
+      <w:t xml:space="preserve"> </w:t>
+    </w:r>
+    <w:hyperlink r:id="rId2" w:tgtFrame="_blank" w:history="1">
       <w:r>
         <w:rPr>
           <w:rStyle w:val="Hyperlink"/>
@@ -1235,18 +1255,9 @@
           <w:iCs/>
           <w:lang w:val="en-US"/>
         </w:rPr>
-        <w:t>https://lmu-osc.github.io/training/open-research-cycle.html</w:t>
-      </w:r>
-    </w:hyperlink>
-    <w:r>
-      <w:rPr>
-        <w:i/>
-        <w:iCs/>
-        <w:lang w:val="en-US"/>
-      </w:rPr>
-      <w:t xml:space="preserve"> </w:t>
-    </w:r>
-    <w:hyperlink r:id="rId2" w:tgtFrame="_blank" w:history="1">
+        <w:t>CC-BY Attribution-</w:t>
+      </w:r>
+      <w:proofErr w:type="spellStart"/>
       <w:r>
         <w:rPr>
           <w:rStyle w:val="Hyperlink"/>
@@ -1254,9 +1265,29 @@
           <w:iCs/>
           <w:lang w:val="en-US"/>
         </w:rPr>
-        <w:t>CC-BY Attribution-ShareAlike 4.0 International</w:t>
+        <w:t>ShareAlike</w:t>
+      </w:r>
+      <w:proofErr w:type="spellEnd"/>
+      <w:r>
+        <w:rPr>
+          <w:rStyle w:val="Hyperlink"/>
+          <w:i/>
+          <w:iCs/>
+          <w:lang w:val="en-US"/>
+        </w:rPr>
+        <w:t xml:space="preserve"> 4.0 International</w:t>
       </w:r>
     </w:hyperlink>
+  </w:p>
+</w:ftr>
+</file>
+
+<file path=word/footer3.xml><?xml version="1.0" encoding="utf-8"?>
+<w:ftr xmlns:wpc="http://schemas.microsoft.com/office/word/2010/wordprocessingCanvas" xmlns:cx="http://schemas.microsoft.com/office/drawing/2014/chartex" xmlns:cx1="http://schemas.microsoft.com/office/drawing/2015/9/8/chartex" xmlns:cx2="http://schemas.microsoft.com/office/drawing/2015/10/21/chartex" xmlns:cx3="http://schemas.microsoft.com/office/drawing/2016/5/9/chartex" xmlns:cx4="http://schemas.microsoft.com/office/drawing/2016/5/10/chartex" xmlns:cx5="http://schemas.microsoft.com/office/drawing/2016/5/11/chartex" xmlns:cx6="http://schemas.microsoft.com/office/drawing/2016/5/12/chartex" xmlns:cx7="http://schemas.microsoft.com/office/drawing/2016/5/13/chartex" xmlns:cx8="http://schemas.microsoft.com/office/drawing/2016/5/14/chartex" xmlns:mc="http://schemas.openxmlformats.org/markup-compatibility/2006" xmlns:aink="http://schemas.microsoft.com/office/drawing/2016/ink" xmlns:am3d="http://schemas.microsoft.com/office/drawing/2017/model3d" xmlns:o="urn:schemas-microsoft-com:office:office" xmlns:oel="http://schemas.microsoft.com/office/2019/extlst" xmlns:r="http://schemas.openxmlformats.org/officeDocument/2006/relationships" xmlns:m="http://schemas.openxmlformats.org/officeDocument/2006/math" xmlns:v="urn:schemas-microsoft-com:vml" xmlns:wp14="http://schemas.microsoft.com/office/word/2010/wordprocessingDrawing" xmlns:wp="http://schemas.openxmlformats.org/drawingml/2006/wordprocessingDrawing" xmlns:w10="urn:schemas-microsoft-com:office:word" xmlns:w="http://schemas.openxmlformats.org/wordprocessingml/2006/main" xmlns:w14="http://schemas.microsoft.com/office/word/2010/wordml" xmlns:w15="http://schemas.microsoft.com/office/word/2012/wordml" xmlns:w16cex="http://schemas.microsoft.com/office/word/2018/wordml/cex" xmlns:w16cid="http://schemas.microsoft.com/office/word/2016/wordml/cid" xmlns:w16="http://schemas.microsoft.com/office/word/2018/wordml" xmlns:w16sdtdh="http://schemas.microsoft.com/office/word/2020/wordml/sdtdatahash" xmlns:w16se="http://schemas.microsoft.com/office/word/2015/wordml/symex" xmlns:wpg="http://schemas.microsoft.com/office/word/2010/wordprocessingGroup" xmlns:wpi="http://schemas.microsoft.com/office/word/2010/wordprocessingInk" xmlns:wne="http://schemas.microsoft.com/office/word/2006/wordml" xmlns:wps="http://schemas.microsoft.com/office/word/2010/wordprocessingShape" mc:Ignorable="w14 w15 w16se w16cid w16 w16cex w16sdtdh wp14">
+  <w:p>
+    <w:pPr>
+      <w:pStyle w:val="Footer"/>
+    </w:pPr>
   </w:p>
 </w:ftr>
 </file>
@@ -1284,6 +1315,36 @@
     </w:p>
   </w:footnote>
 </w:footnotes>
+</file>
+
+<file path=word/header1.xml><?xml version="1.0" encoding="utf-8"?>
+<w:hdr xmlns:wpc="http://schemas.microsoft.com/office/word/2010/wordprocessingCanvas" xmlns:cx="http://schemas.microsoft.com/office/drawing/2014/chartex" xmlns:cx1="http://schemas.microsoft.com/office/drawing/2015/9/8/chartex" xmlns:cx2="http://schemas.microsoft.com/office/drawing/2015/10/21/chartex" xmlns:cx3="http://schemas.microsoft.com/office/drawing/2016/5/9/chartex" xmlns:cx4="http://schemas.microsoft.com/office/drawing/2016/5/10/chartex" xmlns:cx5="http://schemas.microsoft.com/office/drawing/2016/5/11/chartex" xmlns:cx6="http://schemas.microsoft.com/office/drawing/2016/5/12/chartex" xmlns:cx7="http://schemas.microsoft.com/office/drawing/2016/5/13/chartex" xmlns:cx8="http://schemas.microsoft.com/office/drawing/2016/5/14/chartex" xmlns:mc="http://schemas.openxmlformats.org/markup-compatibility/2006" xmlns:aink="http://schemas.microsoft.com/office/drawing/2016/ink" xmlns:am3d="http://schemas.microsoft.com/office/drawing/2017/model3d" xmlns:o="urn:schemas-microsoft-com:office:office" xmlns:oel="http://schemas.microsoft.com/office/2019/extlst" xmlns:r="http://schemas.openxmlformats.org/officeDocument/2006/relationships" xmlns:m="http://schemas.openxmlformats.org/officeDocument/2006/math" xmlns:v="urn:schemas-microsoft-com:vml" xmlns:wp14="http://schemas.microsoft.com/office/word/2010/wordprocessingDrawing" xmlns:wp="http://schemas.openxmlformats.org/drawingml/2006/wordprocessingDrawing" xmlns:w10="urn:schemas-microsoft-com:office:word" xmlns:w="http://schemas.openxmlformats.org/wordprocessingml/2006/main" xmlns:w14="http://schemas.microsoft.com/office/word/2010/wordml" xmlns:w15="http://schemas.microsoft.com/office/word/2012/wordml" xmlns:w16cex="http://schemas.microsoft.com/office/word/2018/wordml/cex" xmlns:w16cid="http://schemas.microsoft.com/office/word/2016/wordml/cid" xmlns:w16="http://schemas.microsoft.com/office/word/2018/wordml" xmlns:w16sdtdh="http://schemas.microsoft.com/office/word/2020/wordml/sdtdatahash" xmlns:w16se="http://schemas.microsoft.com/office/word/2015/wordml/symex" xmlns:wpg="http://schemas.microsoft.com/office/word/2010/wordprocessingGroup" xmlns:wpi="http://schemas.microsoft.com/office/word/2010/wordprocessingInk" xmlns:wne="http://schemas.microsoft.com/office/word/2006/wordml" xmlns:wps="http://schemas.microsoft.com/office/word/2010/wordprocessingShape" mc:Ignorable="w14 w15 w16se w16cid w16 w16cex w16sdtdh wp14">
+  <w:p>
+    <w:pPr>
+      <w:pStyle w:val="Header"/>
+    </w:pPr>
+  </w:p>
+</w:hdr>
+</file>
+
+<file path=word/header2.xml><?xml version="1.0" encoding="utf-8"?>
+<w:hdr xmlns:wpc="http://schemas.microsoft.com/office/word/2010/wordprocessingCanvas" xmlns:cx="http://schemas.microsoft.com/office/drawing/2014/chartex" xmlns:cx1="http://schemas.microsoft.com/office/drawing/2015/9/8/chartex" xmlns:cx2="http://schemas.microsoft.com/office/drawing/2015/10/21/chartex" xmlns:cx3="http://schemas.microsoft.com/office/drawing/2016/5/9/chartex" xmlns:cx4="http://schemas.microsoft.com/office/drawing/2016/5/10/chartex" xmlns:cx5="http://schemas.microsoft.com/office/drawing/2016/5/11/chartex" xmlns:cx6="http://schemas.microsoft.com/office/drawing/2016/5/12/chartex" xmlns:cx7="http://schemas.microsoft.com/office/drawing/2016/5/13/chartex" xmlns:cx8="http://schemas.microsoft.com/office/drawing/2016/5/14/chartex" xmlns:mc="http://schemas.openxmlformats.org/markup-compatibility/2006" xmlns:aink="http://schemas.microsoft.com/office/drawing/2016/ink" xmlns:am3d="http://schemas.microsoft.com/office/drawing/2017/model3d" xmlns:o="urn:schemas-microsoft-com:office:office" xmlns:oel="http://schemas.microsoft.com/office/2019/extlst" xmlns:r="http://schemas.openxmlformats.org/officeDocument/2006/relationships" xmlns:m="http://schemas.openxmlformats.org/officeDocument/2006/math" xmlns:v="urn:schemas-microsoft-com:vml" xmlns:wp14="http://schemas.microsoft.com/office/word/2010/wordprocessingDrawing" xmlns:wp="http://schemas.openxmlformats.org/drawingml/2006/wordprocessingDrawing" xmlns:w10="urn:schemas-microsoft-com:office:word" xmlns:w="http://schemas.openxmlformats.org/wordprocessingml/2006/main" xmlns:w14="http://schemas.microsoft.com/office/word/2010/wordml" xmlns:w15="http://schemas.microsoft.com/office/word/2012/wordml" xmlns:w16cex="http://schemas.microsoft.com/office/word/2018/wordml/cex" xmlns:w16cid="http://schemas.microsoft.com/office/word/2016/wordml/cid" xmlns:w16="http://schemas.microsoft.com/office/word/2018/wordml" xmlns:w16sdtdh="http://schemas.microsoft.com/office/word/2020/wordml/sdtdatahash" xmlns:w16se="http://schemas.microsoft.com/office/word/2015/wordml/symex" xmlns:wpg="http://schemas.microsoft.com/office/word/2010/wordprocessingGroup" xmlns:wpi="http://schemas.microsoft.com/office/word/2010/wordprocessingInk" xmlns:wne="http://schemas.microsoft.com/office/word/2006/wordml" xmlns:wps="http://schemas.microsoft.com/office/word/2010/wordprocessingShape" mc:Ignorable="w14 w15 w16se w16cid w16 w16cex w16sdtdh wp14">
+  <w:p>
+    <w:pPr>
+      <w:pStyle w:val="Header"/>
+    </w:pPr>
+  </w:p>
+</w:hdr>
+</file>
+
+<file path=word/header3.xml><?xml version="1.0" encoding="utf-8"?>
+<w:hdr xmlns:wpc="http://schemas.microsoft.com/office/word/2010/wordprocessingCanvas" xmlns:cx="http://schemas.microsoft.com/office/drawing/2014/chartex" xmlns:cx1="http://schemas.microsoft.com/office/drawing/2015/9/8/chartex" xmlns:cx2="http://schemas.microsoft.com/office/drawing/2015/10/21/chartex" xmlns:cx3="http://schemas.microsoft.com/office/drawing/2016/5/9/chartex" xmlns:cx4="http://schemas.microsoft.com/office/drawing/2016/5/10/chartex" xmlns:cx5="http://schemas.microsoft.com/office/drawing/2016/5/11/chartex" xmlns:cx6="http://schemas.microsoft.com/office/drawing/2016/5/12/chartex" xmlns:cx7="http://schemas.microsoft.com/office/drawing/2016/5/13/chartex" xmlns:cx8="http://schemas.microsoft.com/office/drawing/2016/5/14/chartex" xmlns:mc="http://schemas.openxmlformats.org/markup-compatibility/2006" xmlns:aink="http://schemas.microsoft.com/office/drawing/2016/ink" xmlns:am3d="http://schemas.microsoft.com/office/drawing/2017/model3d" xmlns:o="urn:schemas-microsoft-com:office:office" xmlns:oel="http://schemas.microsoft.com/office/2019/extlst" xmlns:r="http://schemas.openxmlformats.org/officeDocument/2006/relationships" xmlns:m="http://schemas.openxmlformats.org/officeDocument/2006/math" xmlns:v="urn:schemas-microsoft-com:vml" xmlns:wp14="http://schemas.microsoft.com/office/word/2010/wordprocessingDrawing" xmlns:wp="http://schemas.openxmlformats.org/drawingml/2006/wordprocessingDrawing" xmlns:w10="urn:schemas-microsoft-com:office:word" xmlns:w="http://schemas.openxmlformats.org/wordprocessingml/2006/main" xmlns:w14="http://schemas.microsoft.com/office/word/2010/wordml" xmlns:w15="http://schemas.microsoft.com/office/word/2012/wordml" xmlns:w16cex="http://schemas.microsoft.com/office/word/2018/wordml/cex" xmlns:w16cid="http://schemas.microsoft.com/office/word/2016/wordml/cid" xmlns:w16="http://schemas.microsoft.com/office/word/2018/wordml" xmlns:w16sdtdh="http://schemas.microsoft.com/office/word/2020/wordml/sdtdatahash" xmlns:w16se="http://schemas.microsoft.com/office/word/2015/wordml/symex" xmlns:wpg="http://schemas.microsoft.com/office/word/2010/wordprocessingGroup" xmlns:wpi="http://schemas.microsoft.com/office/word/2010/wordprocessingInk" xmlns:wne="http://schemas.microsoft.com/office/word/2006/wordml" xmlns:wps="http://schemas.microsoft.com/office/word/2010/wordprocessingShape" mc:Ignorable="w14 w15 w16se w16cid w16 w16cex w16sdtdh wp14">
+  <w:p>
+    <w:pPr>
+      <w:pStyle w:val="Header"/>
+    </w:pPr>
+  </w:p>
+</w:hdr>
 </file>
 
 <file path=word/numbering.xml><?xml version="1.0" encoding="utf-8"?>
@@ -2654,6 +2715,7 @@
   <w:style w:type="character" w:default="1" w:styleId="DefaultParagraphFont">
     <w:name w:val="Default Paragraph Font"/>
     <w:uiPriority w:val="1"/>
+    <w:semiHidden/>
     <w:unhideWhenUsed/>
   </w:style>
   <w:style w:type="table" w:default="1" w:styleId="TableNormal">

</xml_diff>